<commit_message>
feat(site): add English Mastery to CVs, work section, and command palette
English Mastery (englishmastery.pages.dev) is live with 88 reading lessons
across 9 levels, paired writing/speaking tracks, a schema-validating Node
build, and green CI. Added as a full entry in both CVs (still 2 pages each)
and as a compact "Product Engineering" card on the site, with a plain LIVE
badge since no usage data exists to back a "daily use" claim.

Co-Authored-By: Claude Sonnet 5 <noreply@anthropic.com>
</commit_message>
<xml_diff>
--- a/Samiul_Alam_Sumel_CV.docx
+++ b/Samiul_Alam_Sumel_CV.docx
@@ -1089,6 +1089,97 @@
     </w:p>
     <w:p>
       <w:pPr>
+        <w:spacing w:before="80" w:after="20"/>
+      </w:pPr>
+      <w:r>
+        <w:rPr>
+          <w:b/>
+          <w:color w:val="1E3A5F"/>
+          <w:sz w:val="20"/>
+        </w:rPr>
+        <w:t>English Mastery</w:t>
+      </w:r>
+      <w:r>
+        <w:rPr>
+          <w:color w:val="5A5A5A"/>
+          <w:sz w:val="17"/>
+        </w:rPr>
+        <w:t xml:space="preserve">   —   </w:t>
+      </w:r>
+      <w:hyperlink r:id="rId25">
+        <w:r>
+          <w:rPr>
+            <w:rFonts w:ascii="Calibri" w:hAnsi="Calibri"/>
+            <w:u w:val="single"/>
+            <w:color w:val="B8862A"/>
+            <w:sz w:val="17.6"/>
+          </w:rPr>
+          <w:t>Live</w:t>
+        </w:r>
+      </w:hyperlink>
+      <w:r>
+        <w:rPr>
+          <w:color w:val="5A5A5A"/>
+          <w:sz w:val="17"/>
+        </w:rPr>
+        <w:t xml:space="preserve">  |  </w:t>
+      </w:r>
+      <w:hyperlink r:id="rId26">
+        <w:r>
+          <w:rPr>
+            <w:rFonts w:ascii="Calibri" w:hAnsi="Calibri"/>
+            <w:u w:val="single"/>
+            <w:color w:val="B8862A"/>
+            <w:sz w:val="17.6"/>
+          </w:rPr>
+          <w:t>GitHub</w:t>
+        </w:r>
+      </w:hyperlink>
+    </w:p>
+    <w:p>
+      <w:pPr>
+        <w:spacing w:after="20" w:line="252" w:lineRule="auto"/>
+        <w:jc w:val="both"/>
+      </w:pPr>
+      <w:r>
+        <w:rPr>
+          <w:i/>
+          <w:color w:val="5A5A5A"/>
+          <w:sz w:val="18"/>
+        </w:rPr>
+        <w:t>Problem: English-reading material online is usually a loose pile of pages with no level structure, so a learner can't tell where they are or what to read next.</w:t>
+      </w:r>
+    </w:p>
+    <w:p>
+      <w:pPr>
+        <w:spacing w:after="20" w:line="252" w:lineRule="auto"/>
+        <w:jc w:val="both"/>
+      </w:pPr>
+      <w:r>
+        <w:rPr>
+          <w:i w:val="0"/>
+          <w:color w:val="2A2A2A"/>
+          <w:sz w:val="18"/>
+        </w:rPr>
+        <w:t>Content-driven learning platform: 88 reading lessons across 9 skill levels, each paired with a writing task and a speaking drill. A Node build script validates every Markdown lesson against a schema and generates the whole static site, so adding a lesson is a one-file change. Zero-framework HTML/CSS/vanilla JS output, GitHub Actions CI, auto-deployed to Cloudflare Pages.</w:t>
+      </w:r>
+    </w:p>
+    <w:p>
+      <w:pPr>
+        <w:spacing w:after="60" w:line="252" w:lineRule="auto"/>
+        <w:jc w:val="both"/>
+      </w:pPr>
+      <w:r>
+        <w:rPr>
+          <w:i/>
+          <w:color w:val="5A5A5A"/>
+          <w:sz w:val="17"/>
+        </w:rPr>
+        <w:t>Tech: Node.js, Vanilla JS, Static Site Generation, GitHub Actions, Cloudflare Pages</w:t>
+      </w:r>
+    </w:p>
+    <w:p>
+      <w:pPr>
         <w:spacing w:before="20" w:after="0" w:line="240" w:lineRule="auto"/>
       </w:pPr>
       <w:r>
@@ -1106,7 +1197,7 @@
         </w:rPr>
         <w:t xml:space="preserve">   —   </w:t>
       </w:r>
-      <w:hyperlink r:id="rId25">
+      <w:hyperlink r:id="rId27">
         <w:r>
           <w:rPr>
             <w:rFonts w:ascii="Calibri" w:hAnsi="Calibri"/>
@@ -1124,7 +1215,7 @@
         </w:rPr>
         <w:t xml:space="preserve">  |  </w:t>
       </w:r>
-      <w:hyperlink r:id="rId26">
+      <w:hyperlink r:id="rId28">
         <w:r>
           <w:rPr>
             <w:rFonts w:ascii="Calibri" w:hAnsi="Calibri"/>
@@ -1177,7 +1268,7 @@
         </w:rPr>
         <w:t xml:space="preserve">   —   </w:t>
       </w:r>
-      <w:hyperlink r:id="rId27">
+      <w:hyperlink r:id="rId29">
         <w:r>
           <w:rPr>
             <w:rFonts w:ascii="Calibri" w:hAnsi="Calibri"/>

</xml_diff>

<commit_message>
feat(site): add case studies for English Mastery, SalahSync, World Kitchen Atlas, Client Intake
Four new /projects/* pages built from each repo's code, docs, CI and live
site, with no unmeasured metrics and explicit known gaps. Link them from the
home cards, add them to the sitemap and service-worker precache.

Also correct claims the code contradicted: Client Intake has a Pages
Functions API and admin dashboard (not mailto-only), World Kitchen Atlas
has 295 live dish pages (not 280), and English Mastery has 87 paired
writing/speaking items (lesson 0 has no pair). Existing case-study pages now
link to clean URLs. CVs regenerated (still 2 pages each).

Co-Authored-By: Claude Sonnet 5 <noreply@anthropic.com>
</commit_message>
<xml_diff>
--- a/Samiul_Alam_Sumel_CV.docx
+++ b/Samiul_Alam_Sumel_CV.docx
@@ -888,7 +888,7 @@
           <w:color w:val="2A2A2A"/>
           <w:sz w:val="18"/>
         </w:rPr>
-        <w:t>Single-file, client-side project requirement intake form — structured questions, no backend required, mailto-based report so the completed brief lands directly in an inbox.</w:t>
+        <w:t>Project requirement intake form — 18 structured sections, a serverless submission API, and a password-protected admin dashboard that tracks each lead from New to Won/Lost, with the client's own email app as a fallback.</w:t>
       </w:r>
     </w:p>
     <w:p>
@@ -902,7 +902,7 @@
           <w:color w:val="5A5A5A"/>
           <w:sz w:val="17"/>
         </w:rPr>
-        <w:t>Tech: JavaScript, HTML/CSS, Client-Side Only</w:t>
+        <w:t>Tech: JavaScript, HTML/CSS, Cloudflare Pages Functions, GitHub API</w:t>
       </w:r>
     </w:p>
     <w:p>
@@ -1070,7 +1070,7 @@
           <w:color w:val="2A2A2A"/>
           <w:sz w:val="18"/>
         </w:rPr>
-        <w:t>Next.js static-export culinary encyclopedia on Cloudflare Pages: continent -&gt; country -&gt; dish browsing, client-side search, and a per-dish confidence rating instead of presenting every entry as equally certain. Cloudflare Worker proxies a private GitHub data repo, admin CRUD, and a Durable-Object-backed visit counter. Asia live (7 countries, 280 dishes); other continents planned.</w:t>
+        <w:t>Next.js static-export culinary encyclopedia on Cloudflare Pages: continent -&gt; country -&gt; dish browsing, client-side search, and a per-dish confidence rating instead of presenting every entry as equally certain. Cloudflare Worker proxies a private GitHub data repo, admin CRUD, and a Durable-Object-backed visit counter. Asia live (7 countries, 295 dishes); other continents planned.</w:t>
       </w:r>
     </w:p>
     <w:p>
@@ -1161,7 +1161,7 @@
           <w:color w:val="2A2A2A"/>
           <w:sz w:val="18"/>
         </w:rPr>
-        <w:t>Content-driven learning platform: 88 reading lessons across 9 skill levels, each paired with a writing task and a speaking drill. A Node build script validates every Markdown lesson against a schema and generates the whole static site, so adding a lesson is a one-file change. Zero-framework HTML/CSS/vanilla JS output, GitHub Actions CI, auto-deployed to Cloudflare Pages.</w:t>
+        <w:t>Content-driven learning platform: 88 reading lessons across 9 skill levels with 87 paired writing tasks and speaking drills. A Node build script validates every Markdown lesson against a schema and generates the whole static site, so adding a lesson is a one-file change. Zero-framework HTML/CSS/vanilla JS output, GitHub Actions CI, auto-deployed to Cloudflare Pages.</w:t>
       </w:r>
     </w:p>
     <w:p>

</xml_diff>

<commit_message>
fix(site): new-positioning head metadata, drop real-data assets and links
Replace the old "Product Engineer" title, description, keywords, Open Graph,
JSON-LD and manifest text with the new positioning. Delete the unreferenced
real CarView/OT Bill screenshots and demo GIF. CVs and the Contra profile
now link only the case-study pages; CVs regenerated (2 pages each).

Co-Authored-By: Claude Sonnet 5.5 <noreply@anthropic.com>
</commit_message>
<xml_diff>
--- a/Samiul_Alam_Sumel_CV.docx
+++ b/Samiul_Alam_Sumel_CV.docx
@@ -659,25 +659,7 @@
             <w:color w:val="B8862A"/>
             <w:sz w:val="17.6"/>
           </w:rPr>
-          <w:t>Live</w:t>
-        </w:r>
-      </w:hyperlink>
-      <w:r>
-        <w:rPr>
-          <w:color w:val="5A5A5A"/>
-          <w:sz w:val="17"/>
-        </w:rPr>
-        <w:t xml:space="preserve">  |  </w:t>
-      </w:r>
-      <w:hyperlink r:id="rId16">
-        <w:r>
-          <w:rPr>
-            <w:rFonts w:ascii="Calibri" w:hAnsi="Calibri"/>
-            <w:u w:val="single"/>
-            <w:color w:val="B8862A"/>
-            <w:sz w:val="17.6"/>
-          </w:rPr>
-          <w:t>GitHub</w:t>
+          <w:t>Case study</w:t>
         </w:r>
       </w:hyperlink>
     </w:p>
@@ -742,7 +724,7 @@
         </w:rPr>
         <w:t xml:space="preserve">   —   </w:t>
       </w:r>
-      <w:hyperlink r:id="rId17">
+      <w:hyperlink r:id="rId16">
         <w:r>
           <w:rPr>
             <w:rFonts w:ascii="Calibri" w:hAnsi="Calibri"/>
@@ -750,25 +732,7 @@
             <w:color w:val="B8862A"/>
             <w:sz w:val="17.6"/>
           </w:rPr>
-          <w:t>Live</w:t>
-        </w:r>
-      </w:hyperlink>
-      <w:r>
-        <w:rPr>
-          <w:color w:val="5A5A5A"/>
-          <w:sz w:val="17"/>
-        </w:rPr>
-        <w:t xml:space="preserve">  |  </w:t>
-      </w:r>
-      <w:hyperlink r:id="rId18">
-        <w:r>
-          <w:rPr>
-            <w:rFonts w:ascii="Calibri" w:hAnsi="Calibri"/>
-            <w:u w:val="single"/>
-            <w:color w:val="B8862A"/>
-            <w:sz w:val="17.6"/>
-          </w:rPr>
-          <w:t>GitHub</w:t>
+          <w:t>Case study</w:t>
         </w:r>
       </w:hyperlink>
     </w:p>
@@ -833,7 +797,7 @@
         </w:rPr>
         <w:t xml:space="preserve">   —   </w:t>
       </w:r>
-      <w:hyperlink r:id="rId19">
+      <w:hyperlink r:id="rId17">
         <w:r>
           <w:rPr>
             <w:rFonts w:ascii="Calibri" w:hAnsi="Calibri"/>
@@ -851,7 +815,7 @@
         </w:rPr>
         <w:t xml:space="preserve">  |  </w:t>
       </w:r>
-      <w:hyperlink r:id="rId20">
+      <w:hyperlink r:id="rId18">
         <w:r>
           <w:rPr>
             <w:rFonts w:ascii="Calibri" w:hAnsi="Calibri"/>
@@ -924,7 +888,7 @@
         </w:rPr>
         <w:t xml:space="preserve">   —   </w:t>
       </w:r>
-      <w:hyperlink r:id="rId21">
+      <w:hyperlink r:id="rId19">
         <w:r>
           <w:rPr>
             <w:rFonts w:ascii="Calibri" w:hAnsi="Calibri"/>
@@ -942,7 +906,7 @@
         </w:rPr>
         <w:t xml:space="preserve">  |  </w:t>
       </w:r>
-      <w:hyperlink r:id="rId22">
+      <w:hyperlink r:id="rId20">
         <w:r>
           <w:rPr>
             <w:rFonts w:ascii="Calibri" w:hAnsi="Calibri"/>
@@ -1015,7 +979,7 @@
         </w:rPr>
         <w:t xml:space="preserve">   —   </w:t>
       </w:r>
-      <w:hyperlink r:id="rId23">
+      <w:hyperlink r:id="rId21">
         <w:r>
           <w:rPr>
             <w:rFonts w:ascii="Calibri" w:hAnsi="Calibri"/>
@@ -1033,7 +997,7 @@
         </w:rPr>
         <w:t xml:space="preserve">  |  </w:t>
       </w:r>
-      <w:hyperlink r:id="rId24">
+      <w:hyperlink r:id="rId22">
         <w:r>
           <w:rPr>
             <w:rFonts w:ascii="Calibri" w:hAnsi="Calibri"/>
@@ -1106,7 +1070,7 @@
         </w:rPr>
         <w:t xml:space="preserve">   —   </w:t>
       </w:r>
-      <w:hyperlink r:id="rId25">
+      <w:hyperlink r:id="rId23">
         <w:r>
           <w:rPr>
             <w:rFonts w:ascii="Calibri" w:hAnsi="Calibri"/>
@@ -1124,7 +1088,7 @@
         </w:rPr>
         <w:t xml:space="preserve">  |  </w:t>
       </w:r>
-      <w:hyperlink r:id="rId26">
+      <w:hyperlink r:id="rId24">
         <w:r>
           <w:rPr>
             <w:rFonts w:ascii="Calibri" w:hAnsi="Calibri"/>
@@ -1197,7 +1161,7 @@
         </w:rPr>
         <w:t xml:space="preserve">   —   </w:t>
       </w:r>
-      <w:hyperlink r:id="rId27">
+      <w:hyperlink r:id="rId25">
         <w:r>
           <w:rPr>
             <w:rFonts w:ascii="Calibri" w:hAnsi="Calibri"/>
@@ -1215,7 +1179,7 @@
         </w:rPr>
         <w:t xml:space="preserve">  |  </w:t>
       </w:r>
-      <w:hyperlink r:id="rId28">
+      <w:hyperlink r:id="rId26">
         <w:r>
           <w:rPr>
             <w:rFonts w:ascii="Calibri" w:hAnsi="Calibri"/>
@@ -1268,7 +1232,7 @@
         </w:rPr>
         <w:t xml:space="preserve">   —   </w:t>
       </w:r>
-      <w:hyperlink r:id="rId29">
+      <w:hyperlink r:id="rId27">
         <w:r>
           <w:rPr>
             <w:rFonts w:ascii="Calibri" w:hAnsi="Calibri"/>

</xml_diff>